<commit_message>
Segundo cambio: En el documento de word se elimino un diagrama de los elementos principales de las clases
</commit_message>
<xml_diff>
--- a/Unidad1/elementos principales de las clases.docx
+++ b/Unidad1/elementos principales de las clases.docx
@@ -25,18 +25,7 @@
           <w:sz w:val="27"/>
           <w:szCs w:val="27"/>
         </w:rPr>
-        <w:t>1</w:t>
-      </w:r>
-      <w:r>
-        <w:rPr>
-          <w:rFonts w:asciiTheme="minorHAnsi" w:eastAsia="Times New Roman" w:hAnsiTheme="minorHAnsi" w:cstheme="minorHAnsi"/>
-          <w:b/>
-          <w:bCs/>
-          <w:color w:val="auto"/>
-          <w:sz w:val="27"/>
-          <w:szCs w:val="27"/>
-        </w:rPr>
-        <w:t>. Elementos clave de un Diagrama de Clases</w:t>
+        <w:t>1. Elementos clave de un Diagrama de Clases</w:t>
       </w:r>
     </w:p>
     <w:p>
@@ -1029,617 +1018,6 @@
           <w:szCs w:val="24"/>
         </w:rPr>
       </w:pPr>
-    </w:p>
-    <w:p>
-      <w:pPr>
-        <w:spacing w:before="480" w:after="480" w:line="276" w:lineRule="auto"/>
-        <w:ind w:firstLine="0"/>
-        <w:jc w:val="left"/>
-        <w:rPr>
-          <w:rFonts w:asciiTheme="minorHAnsi" w:eastAsia="Times New Roman" w:hAnsiTheme="minorHAnsi" w:cstheme="minorHAnsi"/>
-          <w:b/>
-          <w:bCs/>
-          <w:color w:val="auto"/>
-          <w:sz w:val="27"/>
-          <w:szCs w:val="27"/>
-        </w:rPr>
-      </w:pPr>
-      <w:r>
-        <w:rPr>
-          <w:rFonts w:asciiTheme="minorHAnsi" w:eastAsia="Times New Roman" w:hAnsiTheme="minorHAnsi" w:cstheme="minorHAnsi"/>
-          <w:b/>
-          <w:bCs/>
-          <w:color w:val="auto"/>
-          <w:sz w:val="27"/>
-          <w:szCs w:val="27"/>
-        </w:rPr>
-        <w:lastRenderedPageBreak/>
-        <w:t>Ejemplo visual rápido en texto (Estructura de una clase)</w:t>
-      </w:r>
-    </w:p>
-    <w:p>
-      <w:pPr>
-        <w:tabs>
-          <w:tab w:val="left" w:pos="916"/>
-          <w:tab w:val="left" w:pos="1832"/>
-          <w:tab w:val="left" w:pos="2748"/>
-          <w:tab w:val="left" w:pos="3664"/>
-          <w:tab w:val="left" w:pos="4580"/>
-          <w:tab w:val="left" w:pos="5496"/>
-          <w:tab w:val="left" w:pos="6412"/>
-          <w:tab w:val="left" w:pos="7328"/>
-          <w:tab w:val="left" w:pos="8244"/>
-          <w:tab w:val="left" w:pos="9160"/>
-          <w:tab w:val="left" w:pos="10076"/>
-          <w:tab w:val="left" w:pos="10992"/>
-          <w:tab w:val="left" w:pos="11908"/>
-          <w:tab w:val="left" w:pos="12824"/>
-          <w:tab w:val="left" w:pos="13740"/>
-          <w:tab w:val="left" w:pos="14656"/>
-        </w:tabs>
-        <w:spacing w:line="240" w:lineRule="auto"/>
-        <w:ind w:firstLine="0"/>
-        <w:jc w:val="left"/>
-        <w:rPr>
-          <w:rFonts w:ascii="Courier New" w:eastAsia="Times New Roman" w:hAnsi="Courier New" w:cs="Courier New"/>
-          <w:color w:val="auto"/>
-          <w:sz w:val="21"/>
-          <w:szCs w:val="21"/>
-        </w:rPr>
-      </w:pPr>
-      <w:r>
-        <w:rPr>
-          <w:rFonts w:ascii="Courier New" w:eastAsia="Times New Roman" w:hAnsi="Courier New" w:cs="Courier New"/>
-          <w:color w:val="auto"/>
-          <w:sz w:val="21"/>
-          <w:szCs w:val="21"/>
-        </w:rPr>
-        <w:t>+-----------------------------------+</w:t>
-      </w:r>
-    </w:p>
-    <w:p>
-      <w:pPr>
-        <w:tabs>
-          <w:tab w:val="left" w:pos="916"/>
-          <w:tab w:val="left" w:pos="1832"/>
-          <w:tab w:val="left" w:pos="2748"/>
-          <w:tab w:val="left" w:pos="3664"/>
-          <w:tab w:val="left" w:pos="4580"/>
-          <w:tab w:val="left" w:pos="5496"/>
-          <w:tab w:val="left" w:pos="6412"/>
-          <w:tab w:val="left" w:pos="7328"/>
-          <w:tab w:val="left" w:pos="8244"/>
-          <w:tab w:val="left" w:pos="9160"/>
-          <w:tab w:val="left" w:pos="10076"/>
-          <w:tab w:val="left" w:pos="10992"/>
-          <w:tab w:val="left" w:pos="11908"/>
-          <w:tab w:val="left" w:pos="12824"/>
-          <w:tab w:val="left" w:pos="13740"/>
-          <w:tab w:val="left" w:pos="14656"/>
-        </w:tabs>
-        <w:spacing w:line="240" w:lineRule="auto"/>
-        <w:ind w:firstLine="0"/>
-        <w:jc w:val="left"/>
-        <w:rPr>
-          <w:rFonts w:ascii="Courier New" w:eastAsia="Times New Roman" w:hAnsi="Courier New" w:cs="Courier New"/>
-          <w:color w:val="auto"/>
-          <w:sz w:val="21"/>
-          <w:szCs w:val="21"/>
-        </w:rPr>
-      </w:pPr>
-    </w:p>
-    <w:p>
-      <w:pPr>
-        <w:tabs>
-          <w:tab w:val="left" w:pos="916"/>
-          <w:tab w:val="left" w:pos="1832"/>
-          <w:tab w:val="left" w:pos="2748"/>
-          <w:tab w:val="left" w:pos="3664"/>
-          <w:tab w:val="left" w:pos="4580"/>
-          <w:tab w:val="left" w:pos="5496"/>
-          <w:tab w:val="left" w:pos="6412"/>
-          <w:tab w:val="left" w:pos="7328"/>
-          <w:tab w:val="left" w:pos="8244"/>
-          <w:tab w:val="left" w:pos="9160"/>
-          <w:tab w:val="left" w:pos="10076"/>
-          <w:tab w:val="left" w:pos="10992"/>
-          <w:tab w:val="left" w:pos="11908"/>
-          <w:tab w:val="left" w:pos="12824"/>
-          <w:tab w:val="left" w:pos="13740"/>
-          <w:tab w:val="left" w:pos="14656"/>
-        </w:tabs>
-        <w:spacing w:line="240" w:lineRule="auto"/>
-        <w:ind w:firstLine="0"/>
-        <w:jc w:val="left"/>
-        <w:rPr>
-          <w:rFonts w:ascii="Courier New" w:eastAsia="Times New Roman" w:hAnsi="Courier New" w:cs="Courier New"/>
-          <w:color w:val="auto"/>
-          <w:sz w:val="21"/>
-          <w:szCs w:val="21"/>
-        </w:rPr>
-      </w:pPr>
-      <w:r>
-        <w:rPr>
-          <w:rFonts w:ascii="Courier New" w:eastAsia="Times New Roman" w:hAnsi="Courier New" w:cs="Courier New"/>
-          <w:color w:val="auto"/>
-          <w:sz w:val="21"/>
-          <w:szCs w:val="21"/>
-        </w:rPr>
-        <w:t>|              Cliente              | &lt;- Nombre de la Clase</w:t>
-      </w:r>
-    </w:p>
-    <w:p>
-      <w:pPr>
-        <w:tabs>
-          <w:tab w:val="left" w:pos="916"/>
-          <w:tab w:val="left" w:pos="1832"/>
-          <w:tab w:val="left" w:pos="2748"/>
-          <w:tab w:val="left" w:pos="3664"/>
-          <w:tab w:val="left" w:pos="4580"/>
-          <w:tab w:val="left" w:pos="5496"/>
-          <w:tab w:val="left" w:pos="6412"/>
-          <w:tab w:val="left" w:pos="7328"/>
-          <w:tab w:val="left" w:pos="8244"/>
-          <w:tab w:val="left" w:pos="9160"/>
-          <w:tab w:val="left" w:pos="10076"/>
-          <w:tab w:val="left" w:pos="10992"/>
-          <w:tab w:val="left" w:pos="11908"/>
-          <w:tab w:val="left" w:pos="12824"/>
-          <w:tab w:val="left" w:pos="13740"/>
-          <w:tab w:val="left" w:pos="14656"/>
-        </w:tabs>
-        <w:spacing w:line="240" w:lineRule="auto"/>
-        <w:ind w:firstLine="0"/>
-        <w:jc w:val="left"/>
-        <w:rPr>
-          <w:rFonts w:ascii="Courier New" w:eastAsia="Times New Roman" w:hAnsi="Courier New" w:cs="Courier New"/>
-          <w:color w:val="auto"/>
-          <w:sz w:val="21"/>
-          <w:szCs w:val="21"/>
-        </w:rPr>
-      </w:pPr>
-      <w:r>
-        <w:rPr>
-          <w:rFonts w:ascii="Courier New" w:eastAsia="Times New Roman" w:hAnsi="Courier New" w:cs="Courier New"/>
-          <w:color w:val="auto"/>
-          <w:sz w:val="21"/>
-          <w:szCs w:val="21"/>
-        </w:rPr>
-        <w:t>+-----------------------------------+</w:t>
-      </w:r>
-    </w:p>
-    <w:p>
-      <w:pPr>
-        <w:tabs>
-          <w:tab w:val="left" w:pos="916"/>
-          <w:tab w:val="left" w:pos="1832"/>
-          <w:tab w:val="left" w:pos="2748"/>
-          <w:tab w:val="left" w:pos="3664"/>
-          <w:tab w:val="left" w:pos="4580"/>
-          <w:tab w:val="left" w:pos="5496"/>
-          <w:tab w:val="left" w:pos="6412"/>
-          <w:tab w:val="left" w:pos="7328"/>
-          <w:tab w:val="left" w:pos="8244"/>
-          <w:tab w:val="left" w:pos="9160"/>
-          <w:tab w:val="left" w:pos="10076"/>
-          <w:tab w:val="left" w:pos="10992"/>
-          <w:tab w:val="left" w:pos="11908"/>
-          <w:tab w:val="left" w:pos="12824"/>
-          <w:tab w:val="left" w:pos="13740"/>
-          <w:tab w:val="left" w:pos="14656"/>
-        </w:tabs>
-        <w:spacing w:line="240" w:lineRule="auto"/>
-        <w:ind w:firstLine="0"/>
-        <w:jc w:val="left"/>
-        <w:rPr>
-          <w:rFonts w:ascii="Courier New" w:eastAsia="Times New Roman" w:hAnsi="Courier New" w:cs="Courier New"/>
-          <w:color w:val="auto"/>
-          <w:sz w:val="21"/>
-          <w:szCs w:val="21"/>
-        </w:rPr>
-      </w:pPr>
-    </w:p>
-    <w:p>
-      <w:pPr>
-        <w:tabs>
-          <w:tab w:val="left" w:pos="916"/>
-          <w:tab w:val="left" w:pos="1832"/>
-          <w:tab w:val="left" w:pos="2748"/>
-          <w:tab w:val="left" w:pos="3664"/>
-          <w:tab w:val="left" w:pos="4580"/>
-          <w:tab w:val="left" w:pos="5496"/>
-          <w:tab w:val="left" w:pos="6412"/>
-          <w:tab w:val="left" w:pos="7328"/>
-          <w:tab w:val="left" w:pos="8244"/>
-          <w:tab w:val="left" w:pos="9160"/>
-          <w:tab w:val="left" w:pos="10076"/>
-          <w:tab w:val="left" w:pos="10992"/>
-          <w:tab w:val="left" w:pos="11908"/>
-          <w:tab w:val="left" w:pos="12824"/>
-          <w:tab w:val="left" w:pos="13740"/>
-          <w:tab w:val="left" w:pos="14656"/>
-        </w:tabs>
-        <w:spacing w:line="240" w:lineRule="auto"/>
-        <w:ind w:firstLine="0"/>
-        <w:jc w:val="left"/>
-        <w:rPr>
-          <w:rFonts w:ascii="Courier New" w:eastAsia="Times New Roman" w:hAnsi="Courier New" w:cs="Courier New"/>
-          <w:color w:val="auto"/>
-          <w:sz w:val="21"/>
-          <w:szCs w:val="21"/>
-        </w:rPr>
-      </w:pPr>
-      <w:r>
-        <w:rPr>
-          <w:rFonts w:ascii="Courier New" w:eastAsia="Times New Roman" w:hAnsi="Courier New" w:cs="Courier New"/>
-          <w:color w:val="auto"/>
-          <w:sz w:val="21"/>
-          <w:szCs w:val="21"/>
-        </w:rPr>
-        <w:t xml:space="preserve">| - id: </w:t>
-      </w:r>
-      <w:proofErr w:type="spellStart"/>
-      <w:r>
-        <w:rPr>
-          <w:rFonts w:ascii="Courier New" w:eastAsia="Times New Roman" w:hAnsi="Courier New" w:cs="Courier New"/>
-          <w:color w:val="auto"/>
-          <w:sz w:val="21"/>
-          <w:szCs w:val="21"/>
-        </w:rPr>
-        <w:t>int</w:t>
-      </w:r>
-      <w:proofErr w:type="spellEnd"/>
-      <w:r>
-        <w:rPr>
-          <w:rFonts w:ascii="Courier New" w:eastAsia="Times New Roman" w:hAnsi="Courier New" w:cs="Courier New"/>
-          <w:color w:val="auto"/>
-          <w:sz w:val="21"/>
-          <w:szCs w:val="21"/>
-        </w:rPr>
-        <w:t xml:space="preserve">                         | &lt;- Atributos Privados (-)</w:t>
-      </w:r>
-    </w:p>
-    <w:p>
-      <w:pPr>
-        <w:tabs>
-          <w:tab w:val="left" w:pos="916"/>
-          <w:tab w:val="left" w:pos="1832"/>
-          <w:tab w:val="left" w:pos="2748"/>
-          <w:tab w:val="left" w:pos="3664"/>
-          <w:tab w:val="left" w:pos="4580"/>
-          <w:tab w:val="left" w:pos="5496"/>
-          <w:tab w:val="left" w:pos="6412"/>
-          <w:tab w:val="left" w:pos="7328"/>
-          <w:tab w:val="left" w:pos="8244"/>
-          <w:tab w:val="left" w:pos="9160"/>
-          <w:tab w:val="left" w:pos="10076"/>
-          <w:tab w:val="left" w:pos="10992"/>
-          <w:tab w:val="left" w:pos="11908"/>
-          <w:tab w:val="left" w:pos="12824"/>
-          <w:tab w:val="left" w:pos="13740"/>
-          <w:tab w:val="left" w:pos="14656"/>
-        </w:tabs>
-        <w:spacing w:line="240" w:lineRule="auto"/>
-        <w:ind w:firstLine="0"/>
-        <w:jc w:val="left"/>
-        <w:rPr>
-          <w:rFonts w:ascii="Courier New" w:eastAsia="Times New Roman" w:hAnsi="Courier New" w:cs="Courier New"/>
-          <w:color w:val="auto"/>
-          <w:sz w:val="21"/>
-          <w:szCs w:val="21"/>
-        </w:rPr>
-      </w:pPr>
-      <w:r>
-        <w:rPr>
-          <w:rFonts w:ascii="Courier New" w:eastAsia="Times New Roman" w:hAnsi="Courier New" w:cs="Courier New"/>
-          <w:color w:val="auto"/>
-          <w:sz w:val="21"/>
-          <w:szCs w:val="21"/>
-        </w:rPr>
-        <w:t xml:space="preserve">| - nombre: </w:t>
-      </w:r>
-      <w:proofErr w:type="spellStart"/>
-      <w:r>
-        <w:rPr>
-          <w:rFonts w:ascii="Courier New" w:eastAsia="Times New Roman" w:hAnsi="Courier New" w:cs="Courier New"/>
-          <w:color w:val="auto"/>
-          <w:sz w:val="21"/>
-          <w:szCs w:val="21"/>
-        </w:rPr>
-        <w:t>String</w:t>
-      </w:r>
-      <w:proofErr w:type="spellEnd"/>
-      <w:r>
-        <w:rPr>
-          <w:rFonts w:ascii="Courier New" w:eastAsia="Times New Roman" w:hAnsi="Courier New" w:cs="Courier New"/>
-          <w:color w:val="auto"/>
-          <w:sz w:val="21"/>
-          <w:szCs w:val="21"/>
-        </w:rPr>
-        <w:t xml:space="preserve">                  |</w:t>
-      </w:r>
-    </w:p>
-    <w:p>
-      <w:pPr>
-        <w:tabs>
-          <w:tab w:val="left" w:pos="916"/>
-          <w:tab w:val="left" w:pos="1832"/>
-          <w:tab w:val="left" w:pos="2748"/>
-          <w:tab w:val="left" w:pos="3664"/>
-          <w:tab w:val="left" w:pos="4580"/>
-          <w:tab w:val="left" w:pos="5496"/>
-          <w:tab w:val="left" w:pos="6412"/>
-          <w:tab w:val="left" w:pos="7328"/>
-          <w:tab w:val="left" w:pos="8244"/>
-          <w:tab w:val="left" w:pos="9160"/>
-          <w:tab w:val="left" w:pos="10076"/>
-          <w:tab w:val="left" w:pos="10992"/>
-          <w:tab w:val="left" w:pos="11908"/>
-          <w:tab w:val="left" w:pos="12824"/>
-          <w:tab w:val="left" w:pos="13740"/>
-          <w:tab w:val="left" w:pos="14656"/>
-        </w:tabs>
-        <w:spacing w:line="240" w:lineRule="auto"/>
-        <w:ind w:firstLine="0"/>
-        <w:jc w:val="left"/>
-        <w:rPr>
-          <w:rFonts w:ascii="Courier New" w:eastAsia="Times New Roman" w:hAnsi="Courier New" w:cs="Courier New"/>
-          <w:color w:val="auto"/>
-          <w:sz w:val="21"/>
-          <w:szCs w:val="21"/>
-        </w:rPr>
-      </w:pPr>
-      <w:r>
-        <w:rPr>
-          <w:rFonts w:ascii="Courier New" w:eastAsia="Times New Roman" w:hAnsi="Courier New" w:cs="Courier New"/>
-          <w:color w:val="auto"/>
-          <w:sz w:val="21"/>
-          <w:szCs w:val="21"/>
-        </w:rPr>
-        <w:t>+-----------------------------------+</w:t>
-      </w:r>
-    </w:p>
-    <w:p>
-      <w:pPr>
-        <w:tabs>
-          <w:tab w:val="left" w:pos="916"/>
-          <w:tab w:val="left" w:pos="1832"/>
-          <w:tab w:val="left" w:pos="2748"/>
-          <w:tab w:val="left" w:pos="3664"/>
-          <w:tab w:val="left" w:pos="4580"/>
-          <w:tab w:val="left" w:pos="5496"/>
-          <w:tab w:val="left" w:pos="6412"/>
-          <w:tab w:val="left" w:pos="7328"/>
-          <w:tab w:val="left" w:pos="8244"/>
-          <w:tab w:val="left" w:pos="9160"/>
-          <w:tab w:val="left" w:pos="10076"/>
-          <w:tab w:val="left" w:pos="10992"/>
-          <w:tab w:val="left" w:pos="11908"/>
-          <w:tab w:val="left" w:pos="12824"/>
-          <w:tab w:val="left" w:pos="13740"/>
-          <w:tab w:val="left" w:pos="14656"/>
-        </w:tabs>
-        <w:spacing w:line="240" w:lineRule="auto"/>
-        <w:ind w:firstLine="0"/>
-        <w:jc w:val="left"/>
-        <w:rPr>
-          <w:rFonts w:ascii="Courier New" w:eastAsia="Times New Roman" w:hAnsi="Courier New" w:cs="Courier New"/>
-          <w:color w:val="auto"/>
-          <w:sz w:val="21"/>
-          <w:szCs w:val="21"/>
-        </w:rPr>
-      </w:pPr>
-    </w:p>
-    <w:p>
-      <w:pPr>
-        <w:tabs>
-          <w:tab w:val="left" w:pos="916"/>
-          <w:tab w:val="left" w:pos="1832"/>
-          <w:tab w:val="left" w:pos="2748"/>
-          <w:tab w:val="left" w:pos="3664"/>
-          <w:tab w:val="left" w:pos="4580"/>
-          <w:tab w:val="left" w:pos="5496"/>
-          <w:tab w:val="left" w:pos="6412"/>
-          <w:tab w:val="left" w:pos="7328"/>
-          <w:tab w:val="left" w:pos="8244"/>
-          <w:tab w:val="left" w:pos="9160"/>
-          <w:tab w:val="left" w:pos="10076"/>
-          <w:tab w:val="left" w:pos="10992"/>
-          <w:tab w:val="left" w:pos="11908"/>
-          <w:tab w:val="left" w:pos="12824"/>
-          <w:tab w:val="left" w:pos="13740"/>
-          <w:tab w:val="left" w:pos="14656"/>
-        </w:tabs>
-        <w:spacing w:line="240" w:lineRule="auto"/>
-        <w:ind w:firstLine="0"/>
-        <w:jc w:val="left"/>
-        <w:rPr>
-          <w:rFonts w:ascii="Courier New" w:eastAsia="Times New Roman" w:hAnsi="Courier New" w:cs="Courier New"/>
-          <w:color w:val="auto"/>
-          <w:sz w:val="21"/>
-          <w:szCs w:val="21"/>
-        </w:rPr>
-      </w:pPr>
-      <w:r>
-        <w:rPr>
-          <w:rFonts w:ascii="Courier New" w:eastAsia="Times New Roman" w:hAnsi="Courier New" w:cs="Courier New"/>
-          <w:color w:val="auto"/>
-          <w:sz w:val="21"/>
-          <w:szCs w:val="21"/>
-        </w:rPr>
-        <w:t xml:space="preserve">| + </w:t>
-      </w:r>
-      <w:proofErr w:type="spellStart"/>
-      <w:r>
-        <w:rPr>
-          <w:rFonts w:ascii="Courier New" w:eastAsia="Times New Roman" w:hAnsi="Courier New" w:cs="Courier New"/>
-          <w:color w:val="auto"/>
-          <w:sz w:val="21"/>
-          <w:szCs w:val="21"/>
-        </w:rPr>
-        <w:t>realizarCompra</w:t>
-      </w:r>
-      <w:proofErr w:type="spellEnd"/>
-      <w:r>
-        <w:rPr>
-          <w:rFonts w:ascii="Courier New" w:eastAsia="Times New Roman" w:hAnsi="Courier New" w:cs="Courier New"/>
-          <w:color w:val="auto"/>
-          <w:sz w:val="21"/>
-          <w:szCs w:val="21"/>
-        </w:rPr>
-        <w:t xml:space="preserve">(): </w:t>
-      </w:r>
-      <w:proofErr w:type="spellStart"/>
-      <w:r>
-        <w:rPr>
-          <w:rFonts w:ascii="Courier New" w:eastAsia="Times New Roman" w:hAnsi="Courier New" w:cs="Courier New"/>
-          <w:color w:val="auto"/>
-          <w:sz w:val="21"/>
-          <w:szCs w:val="21"/>
-        </w:rPr>
-        <w:t>void</w:t>
-      </w:r>
-      <w:proofErr w:type="spellEnd"/>
-      <w:r>
-        <w:rPr>
-          <w:rFonts w:ascii="Courier New" w:eastAsia="Times New Roman" w:hAnsi="Courier New" w:cs="Courier New"/>
-          <w:color w:val="auto"/>
-          <w:sz w:val="21"/>
-          <w:szCs w:val="21"/>
-        </w:rPr>
-        <w:t xml:space="preserve">          | &lt;- Métodos Públicos (+)</w:t>
-      </w:r>
-    </w:p>
-    <w:p>
-      <w:pPr>
-        <w:tabs>
-          <w:tab w:val="left" w:pos="916"/>
-          <w:tab w:val="left" w:pos="1832"/>
-          <w:tab w:val="left" w:pos="2748"/>
-          <w:tab w:val="left" w:pos="3664"/>
-          <w:tab w:val="left" w:pos="4580"/>
-          <w:tab w:val="left" w:pos="5496"/>
-          <w:tab w:val="left" w:pos="6412"/>
-          <w:tab w:val="left" w:pos="7328"/>
-          <w:tab w:val="left" w:pos="8244"/>
-          <w:tab w:val="left" w:pos="9160"/>
-          <w:tab w:val="left" w:pos="10076"/>
-          <w:tab w:val="left" w:pos="10992"/>
-          <w:tab w:val="left" w:pos="11908"/>
-          <w:tab w:val="left" w:pos="12824"/>
-          <w:tab w:val="left" w:pos="13740"/>
-          <w:tab w:val="left" w:pos="14656"/>
-        </w:tabs>
-        <w:spacing w:line="240" w:lineRule="auto"/>
-        <w:ind w:firstLine="0"/>
-        <w:jc w:val="left"/>
-        <w:rPr>
-          <w:rFonts w:ascii="Courier New" w:eastAsia="Times New Roman" w:hAnsi="Courier New" w:cs="Courier New"/>
-          <w:color w:val="auto"/>
-          <w:sz w:val="21"/>
-          <w:szCs w:val="21"/>
-        </w:rPr>
-      </w:pPr>
-      <w:r>
-        <w:rPr>
-          <w:rFonts w:ascii="Courier New" w:eastAsia="Times New Roman" w:hAnsi="Courier New" w:cs="Courier New"/>
-          <w:color w:val="auto"/>
-          <w:sz w:val="21"/>
-          <w:szCs w:val="21"/>
-        </w:rPr>
-        <w:t xml:space="preserve">| + </w:t>
-      </w:r>
-      <w:proofErr w:type="spellStart"/>
-      <w:proofErr w:type="gramStart"/>
-      <w:r>
-        <w:rPr>
-          <w:rFonts w:ascii="Courier New" w:eastAsia="Times New Roman" w:hAnsi="Courier New" w:cs="Courier New"/>
-          <w:color w:val="auto"/>
-          <w:sz w:val="21"/>
-          <w:szCs w:val="21"/>
-        </w:rPr>
-        <w:t>actualizarDatos</w:t>
-      </w:r>
-      <w:proofErr w:type="spellEnd"/>
-      <w:r>
-        <w:rPr>
-          <w:rFonts w:ascii="Courier New" w:eastAsia="Times New Roman" w:hAnsi="Courier New" w:cs="Courier New"/>
-          <w:color w:val="auto"/>
-          <w:sz w:val="21"/>
-          <w:szCs w:val="21"/>
-        </w:rPr>
-        <w:t>(</w:t>
-      </w:r>
-      <w:proofErr w:type="gramEnd"/>
-      <w:r>
-        <w:rPr>
-          <w:rFonts w:ascii="Courier New" w:eastAsia="Times New Roman" w:hAnsi="Courier New" w:cs="Courier New"/>
-          <w:color w:val="auto"/>
-          <w:sz w:val="21"/>
-          <w:szCs w:val="21"/>
-        </w:rPr>
-        <w:t xml:space="preserve">): </w:t>
-      </w:r>
-      <w:proofErr w:type="spellStart"/>
-      <w:r>
-        <w:rPr>
-          <w:rFonts w:ascii="Courier New" w:eastAsia="Times New Roman" w:hAnsi="Courier New" w:cs="Courier New"/>
-          <w:color w:val="auto"/>
-          <w:sz w:val="21"/>
-          <w:szCs w:val="21"/>
-        </w:rPr>
-        <w:t>void</w:t>
-      </w:r>
-      <w:proofErr w:type="spellEnd"/>
-      <w:r>
-        <w:rPr>
-          <w:rFonts w:ascii="Courier New" w:eastAsia="Times New Roman" w:hAnsi="Courier New" w:cs="Courier New"/>
-          <w:color w:val="auto"/>
-          <w:sz w:val="21"/>
-          <w:szCs w:val="21"/>
-        </w:rPr>
-        <w:t xml:space="preserve">         |</w:t>
-      </w:r>
-    </w:p>
-    <w:p>
-      <w:pPr>
-        <w:tabs>
-          <w:tab w:val="left" w:pos="916"/>
-          <w:tab w:val="left" w:pos="1832"/>
-          <w:tab w:val="left" w:pos="2748"/>
-          <w:tab w:val="left" w:pos="3664"/>
-          <w:tab w:val="left" w:pos="4580"/>
-          <w:tab w:val="left" w:pos="5496"/>
-          <w:tab w:val="left" w:pos="6412"/>
-          <w:tab w:val="left" w:pos="7328"/>
-          <w:tab w:val="left" w:pos="8244"/>
-          <w:tab w:val="left" w:pos="9160"/>
-          <w:tab w:val="left" w:pos="10076"/>
-          <w:tab w:val="left" w:pos="10992"/>
-          <w:tab w:val="left" w:pos="11908"/>
-          <w:tab w:val="left" w:pos="12824"/>
-          <w:tab w:val="left" w:pos="13740"/>
-          <w:tab w:val="left" w:pos="14656"/>
-        </w:tabs>
-        <w:spacing w:line="240" w:lineRule="auto"/>
-        <w:ind w:firstLine="0"/>
-        <w:jc w:val="left"/>
-        <w:rPr>
-          <w:rFonts w:ascii="Courier New" w:eastAsia="Times New Roman" w:hAnsi="Courier New" w:cs="Courier New"/>
-          <w:color w:val="auto"/>
-          <w:sz w:val="21"/>
-          <w:szCs w:val="21"/>
-        </w:rPr>
-      </w:pPr>
-      <w:r>
-        <w:rPr>
-          <w:rFonts w:ascii="Courier New" w:eastAsia="Times New Roman" w:hAnsi="Courier New" w:cs="Courier New"/>
-          <w:color w:val="auto"/>
-          <w:sz w:val="21"/>
-          <w:szCs w:val="21"/>
-        </w:rPr>
-        <w:t>+-----------------------------------+</w:t>
-      </w:r>
     </w:p>
     <w:p/>
     <w:sectPr>

</xml_diff>